<commit_message>
fmea kp pu ri refactoring
</commit_message>
<xml_diff>
--- a/src/main/resources/templates/WI.docx
+++ b/src/main/resources/templates/WI.docx
@@ -1,6 +1,6 @@
 
 <file path=word/document.xml><?xml version="1.0" encoding="utf-8"?>
-<w:document xmlns:wpc="http://schemas.microsoft.com/office/word/2010/wordprocessingCanvas" xmlns:cx="http://schemas.microsoft.com/office/drawing/2014/chartex" xmlns:cx1="http://schemas.microsoft.com/office/drawing/2015/9/8/chartex" xmlns:cx2="http://schemas.microsoft.com/office/drawing/2015/10/21/chartex" xmlns:cx3="http://schemas.microsoft.com/office/drawing/2016/5/9/chartex" xmlns:cx4="http://schemas.microsoft.com/office/drawing/2016/5/10/chartex" xmlns:cx5="http://schemas.microsoft.com/office/drawing/2016/5/11/chartex" xmlns:cx6="http://schemas.microsoft.com/office/drawing/2016/5/12/chartex" xmlns:cx7="http://schemas.microsoft.com/office/drawing/2016/5/13/chartex" xmlns:cx8="http://schemas.microsoft.com/office/drawing/2016/5/14/chartex" xmlns:mc="http://schemas.openxmlformats.org/markup-compatibility/2006" xmlns:aink="http://schemas.microsoft.com/office/drawing/2016/ink" xmlns:am3d="http://schemas.microsoft.com/office/drawing/2017/model3d" xmlns:o="urn:schemas-microsoft-com:office:office" xmlns:r="http://schemas.openxmlformats.org/officeDocument/2006/relationships" xmlns:m="http://schemas.openxmlformats.org/officeDocument/2006/math" xmlns:v="urn:schemas-microsoft-com:vml" xmlns:wp14="http://schemas.microsoft.com/office/word/2010/wordprocessingDrawing" xmlns:wp="http://schemas.openxmlformats.org/drawingml/2006/wordprocessingDrawing" xmlns:w10="urn:schemas-microsoft-com:office:word" xmlns:w="http://schemas.openxmlformats.org/wordprocessingml/2006/main" xmlns:w14="http://schemas.microsoft.com/office/word/2010/wordml" xmlns:w15="http://schemas.microsoft.com/office/word/2012/wordml" xmlns:w16cid="http://schemas.microsoft.com/office/word/2016/wordml/cid" xmlns:w16se="http://schemas.microsoft.com/office/word/2015/wordml/symex" xmlns:wpg="http://schemas.microsoft.com/office/word/2010/wordprocessingGroup" xmlns:wpi="http://schemas.microsoft.com/office/word/2010/wordprocessingInk" xmlns:wne="http://schemas.microsoft.com/office/word/2006/wordml" xmlns:wps="http://schemas.microsoft.com/office/word/2010/wordprocessingShape" mc:Ignorable="w14 w15 w16se w16cid wp14">
+<w:document xmlns:wpc="http://schemas.microsoft.com/office/word/2010/wordprocessingCanvas" xmlns:cx="http://schemas.microsoft.com/office/drawing/2014/chartex" xmlns:cx1="http://schemas.microsoft.com/office/drawing/2015/9/8/chartex" xmlns:cx2="http://schemas.microsoft.com/office/drawing/2015/10/21/chartex" xmlns:cx3="http://schemas.microsoft.com/office/drawing/2016/5/9/chartex" xmlns:cx4="http://schemas.microsoft.com/office/drawing/2016/5/10/chartex" xmlns:cx5="http://schemas.microsoft.com/office/drawing/2016/5/11/chartex" xmlns:cx6="http://schemas.microsoft.com/office/drawing/2016/5/12/chartex" xmlns:cx7="http://schemas.microsoft.com/office/drawing/2016/5/13/chartex" xmlns:cx8="http://schemas.microsoft.com/office/drawing/2016/5/14/chartex" xmlns:mc="http://schemas.openxmlformats.org/markup-compatibility/2006" xmlns:aink="http://schemas.microsoft.com/office/drawing/2016/ink" xmlns:am3d="http://schemas.microsoft.com/office/drawing/2017/model3d" xmlns:o="urn:schemas-microsoft-com:office:office" xmlns:oel="http://schemas.microsoft.com/office/2019/extlst" xmlns:r="http://schemas.openxmlformats.org/officeDocument/2006/relationships" xmlns:m="http://schemas.openxmlformats.org/officeDocument/2006/math" xmlns:v="urn:schemas-microsoft-com:vml" xmlns:wp14="http://schemas.microsoft.com/office/word/2010/wordprocessingDrawing" xmlns:wp="http://schemas.openxmlformats.org/drawingml/2006/wordprocessingDrawing" xmlns:w10="urn:schemas-microsoft-com:office:word" xmlns:w="http://schemas.openxmlformats.org/wordprocessingml/2006/main" xmlns:w14="http://schemas.microsoft.com/office/word/2010/wordml" xmlns:w15="http://schemas.microsoft.com/office/word/2012/wordml" xmlns:w16cex="http://schemas.microsoft.com/office/word/2018/wordml/cex" xmlns:w16cid="http://schemas.microsoft.com/office/word/2016/wordml/cid" xmlns:w16="http://schemas.microsoft.com/office/word/2018/wordml" xmlns:w16du="http://schemas.microsoft.com/office/word/2023/wordml/word16du" xmlns:w16sdtdh="http://schemas.microsoft.com/office/word/2020/wordml/sdtdatahash" xmlns:w16sdtfl="http://schemas.microsoft.com/office/word/2024/wordml/sdtformatlock" xmlns:w16se="http://schemas.microsoft.com/office/word/2015/wordml/symex" xmlns:wpg="http://schemas.microsoft.com/office/word/2010/wordprocessingGroup" xmlns:wpi="http://schemas.microsoft.com/office/word/2010/wordprocessingInk" xmlns:wne="http://schemas.microsoft.com/office/word/2006/wordml" xmlns:wps="http://schemas.microsoft.com/office/word/2010/wordprocessingShape" mc:Ignorable="w14 w15 w16se w16cid w16 w16cex w16sdtdh w16sdtfl w16du wp14">
   <w:background w:color="FFFFFF"/>
   <w:body>
     <w:tbl>
@@ -32,7 +32,6 @@
               <w:left w:val="single" w:sz="1" w:space="0" w:color="000000"/>
               <w:bottom w:val="single" w:sz="4" w:space="0" w:color="auto"/>
             </w:tcBorders>
-            <w:shd w:val="clear" w:color="auto" w:fill="auto"/>
           </w:tcPr>
           <w:p>
             <w:pPr>
@@ -74,7 +73,6 @@
               <w:left w:val="single" w:sz="1" w:space="0" w:color="000000"/>
               <w:bottom w:val="single" w:sz="4" w:space="0" w:color="auto"/>
             </w:tcBorders>
-            <w:shd w:val="clear" w:color="auto" w:fill="auto"/>
           </w:tcPr>
           <w:p>
             <w:pPr>
@@ -99,7 +97,6 @@
               <w:left w:val="single" w:sz="1" w:space="0" w:color="000000"/>
               <w:bottom w:val="single" w:sz="4" w:space="0" w:color="auto"/>
             </w:tcBorders>
-            <w:shd w:val="clear" w:color="auto" w:fill="auto"/>
           </w:tcPr>
           <w:p>
             <w:pPr>
@@ -125,7 +122,6 @@
               <w:left w:val="single" w:sz="1" w:space="0" w:color="000000"/>
               <w:bottom w:val="single" w:sz="4" w:space="0" w:color="auto"/>
             </w:tcBorders>
-            <w:shd w:val="clear" w:color="auto" w:fill="auto"/>
           </w:tcPr>
           <w:p>
             <w:pPr>
@@ -152,7 +148,6 @@
               <w:bottom w:val="single" w:sz="4" w:space="0" w:color="auto"/>
               <w:right w:val="single" w:sz="1" w:space="0" w:color="000000"/>
             </w:tcBorders>
-            <w:shd w:val="clear" w:color="auto" w:fill="auto"/>
           </w:tcPr>
           <w:p>
             <w:pPr>
@@ -181,7 +176,6 @@
               <w:bottom w:val="single" w:sz="4" w:space="0" w:color="auto"/>
               <w:right w:val="single" w:sz="4" w:space="0" w:color="auto"/>
             </w:tcBorders>
-            <w:shd w:val="clear" w:color="auto" w:fill="auto"/>
           </w:tcPr>
           <w:p>
             <w:pPr>
@@ -208,7 +202,6 @@
               <w:bottom w:val="single" w:sz="4" w:space="0" w:color="auto"/>
               <w:right w:val="single" w:sz="4" w:space="0" w:color="auto"/>
             </w:tcBorders>
-            <w:shd w:val="clear" w:color="auto" w:fill="auto"/>
           </w:tcPr>
           <w:p>
             <w:pPr>
@@ -235,7 +228,6 @@
               <w:bottom w:val="single" w:sz="4" w:space="0" w:color="auto"/>
               <w:right w:val="single" w:sz="4" w:space="0" w:color="auto"/>
             </w:tcBorders>
-            <w:shd w:val="clear" w:color="auto" w:fill="auto"/>
           </w:tcPr>
           <w:p>
             <w:pPr>
@@ -262,7 +254,6 @@
               <w:bottom w:val="single" w:sz="4" w:space="0" w:color="auto"/>
               <w:right w:val="single" w:sz="4" w:space="0" w:color="auto"/>
             </w:tcBorders>
-            <w:shd w:val="clear" w:color="auto" w:fill="auto"/>
           </w:tcPr>
           <w:p>
             <w:pPr>
@@ -291,7 +282,6 @@
               <w:bottom w:val="single" w:sz="4" w:space="0" w:color="auto"/>
               <w:right w:val="single" w:sz="4" w:space="0" w:color="auto"/>
             </w:tcBorders>
-            <w:shd w:val="clear" w:color="auto" w:fill="auto"/>
           </w:tcPr>
           <w:p>
             <w:pPr>
@@ -313,10 +303,7 @@
         </w:tc>
       </w:tr>
     </w:tbl>
-    <w:p>
-      <w:bookmarkStart w:id="0" w:name="_GoBack"/>
-      <w:bookmarkEnd w:id="0"/>
-    </w:p>
+    <w:p/>
     <w:sectPr>
       <w:headerReference w:type="default" r:id="rId6"/>
       <w:pgSz w:w="16838" w:h="11906" w:orient="landscape"/>
@@ -328,7 +315,7 @@
 </file>
 
 <file path=word/endnotes.xml><?xml version="1.0" encoding="utf-8"?>
-<w:endnotes xmlns:wpc="http://schemas.microsoft.com/office/word/2010/wordprocessingCanvas" xmlns:cx="http://schemas.microsoft.com/office/drawing/2014/chartex" xmlns:cx1="http://schemas.microsoft.com/office/drawing/2015/9/8/chartex" xmlns:cx2="http://schemas.microsoft.com/office/drawing/2015/10/21/chartex" xmlns:cx3="http://schemas.microsoft.com/office/drawing/2016/5/9/chartex" xmlns:cx4="http://schemas.microsoft.com/office/drawing/2016/5/10/chartex" xmlns:cx5="http://schemas.microsoft.com/office/drawing/2016/5/11/chartex" xmlns:cx6="http://schemas.microsoft.com/office/drawing/2016/5/12/chartex" xmlns:cx7="http://schemas.microsoft.com/office/drawing/2016/5/13/chartex" xmlns:cx8="http://schemas.microsoft.com/office/drawing/2016/5/14/chartex" xmlns:mc="http://schemas.openxmlformats.org/markup-compatibility/2006" xmlns:aink="http://schemas.microsoft.com/office/drawing/2016/ink" xmlns:am3d="http://schemas.microsoft.com/office/drawing/2017/model3d" xmlns:o="urn:schemas-microsoft-com:office:office" xmlns:r="http://schemas.openxmlformats.org/officeDocument/2006/relationships" xmlns:m="http://schemas.openxmlformats.org/officeDocument/2006/math" xmlns:v="urn:schemas-microsoft-com:vml" xmlns:wp14="http://schemas.microsoft.com/office/word/2010/wordprocessingDrawing" xmlns:wp="http://schemas.openxmlformats.org/drawingml/2006/wordprocessingDrawing" xmlns:w10="urn:schemas-microsoft-com:office:word" xmlns:w="http://schemas.openxmlformats.org/wordprocessingml/2006/main" xmlns:w14="http://schemas.microsoft.com/office/word/2010/wordml" xmlns:w15="http://schemas.microsoft.com/office/word/2012/wordml" xmlns:w16cid="http://schemas.microsoft.com/office/word/2016/wordml/cid" xmlns:w16se="http://schemas.microsoft.com/office/word/2015/wordml/symex" xmlns:wpg="http://schemas.microsoft.com/office/word/2010/wordprocessingGroup" xmlns:wpi="http://schemas.microsoft.com/office/word/2010/wordprocessingInk" xmlns:wne="http://schemas.microsoft.com/office/word/2006/wordml" xmlns:wps="http://schemas.microsoft.com/office/word/2010/wordprocessingShape" mc:Ignorable="w14 w15 w16se w16cid wp14">
+<w:endnotes xmlns:wpc="http://schemas.microsoft.com/office/word/2010/wordprocessingCanvas" xmlns:cx="http://schemas.microsoft.com/office/drawing/2014/chartex" xmlns:cx1="http://schemas.microsoft.com/office/drawing/2015/9/8/chartex" xmlns:cx2="http://schemas.microsoft.com/office/drawing/2015/10/21/chartex" xmlns:cx3="http://schemas.microsoft.com/office/drawing/2016/5/9/chartex" xmlns:cx4="http://schemas.microsoft.com/office/drawing/2016/5/10/chartex" xmlns:cx5="http://schemas.microsoft.com/office/drawing/2016/5/11/chartex" xmlns:cx6="http://schemas.microsoft.com/office/drawing/2016/5/12/chartex" xmlns:cx7="http://schemas.microsoft.com/office/drawing/2016/5/13/chartex" xmlns:cx8="http://schemas.microsoft.com/office/drawing/2016/5/14/chartex" xmlns:mc="http://schemas.openxmlformats.org/markup-compatibility/2006" xmlns:aink="http://schemas.microsoft.com/office/drawing/2016/ink" xmlns:am3d="http://schemas.microsoft.com/office/drawing/2017/model3d" xmlns:o="urn:schemas-microsoft-com:office:office" xmlns:oel="http://schemas.microsoft.com/office/2019/extlst" xmlns:r="http://schemas.openxmlformats.org/officeDocument/2006/relationships" xmlns:m="http://schemas.openxmlformats.org/officeDocument/2006/math" xmlns:v="urn:schemas-microsoft-com:vml" xmlns:wp14="http://schemas.microsoft.com/office/word/2010/wordprocessingDrawing" xmlns:wp="http://schemas.openxmlformats.org/drawingml/2006/wordprocessingDrawing" xmlns:w10="urn:schemas-microsoft-com:office:word" xmlns:w="http://schemas.openxmlformats.org/wordprocessingml/2006/main" xmlns:w14="http://schemas.microsoft.com/office/word/2010/wordml" xmlns:w15="http://schemas.microsoft.com/office/word/2012/wordml" xmlns:w16cex="http://schemas.microsoft.com/office/word/2018/wordml/cex" xmlns:w16cid="http://schemas.microsoft.com/office/word/2016/wordml/cid" xmlns:w16="http://schemas.microsoft.com/office/word/2018/wordml" xmlns:w16du="http://schemas.microsoft.com/office/word/2023/wordml/word16du" xmlns:w16sdtdh="http://schemas.microsoft.com/office/word/2020/wordml/sdtdatahash" xmlns:w16sdtfl="http://schemas.microsoft.com/office/word/2024/wordml/sdtformatlock" xmlns:w16se="http://schemas.microsoft.com/office/word/2015/wordml/symex" xmlns:wpg="http://schemas.microsoft.com/office/word/2010/wordprocessingGroup" xmlns:wpi="http://schemas.microsoft.com/office/word/2010/wordprocessingInk" xmlns:wne="http://schemas.microsoft.com/office/word/2006/wordml" xmlns:wps="http://schemas.microsoft.com/office/word/2010/wordprocessingShape" mc:Ignorable="w14 w15 w16se w16cid w16 w16cex w16sdtdh w16sdtfl w16du wp14">
   <w:endnote w:type="separator" w:id="-1">
     <w:p>
       <w:r>
@@ -347,7 +334,7 @@
 </file>
 
 <file path=word/footnotes.xml><?xml version="1.0" encoding="utf-8"?>
-<w:footnotes xmlns:wpc="http://schemas.microsoft.com/office/word/2010/wordprocessingCanvas" xmlns:cx="http://schemas.microsoft.com/office/drawing/2014/chartex" xmlns:cx1="http://schemas.microsoft.com/office/drawing/2015/9/8/chartex" xmlns:cx2="http://schemas.microsoft.com/office/drawing/2015/10/21/chartex" xmlns:cx3="http://schemas.microsoft.com/office/drawing/2016/5/9/chartex" xmlns:cx4="http://schemas.microsoft.com/office/drawing/2016/5/10/chartex" xmlns:cx5="http://schemas.microsoft.com/office/drawing/2016/5/11/chartex" xmlns:cx6="http://schemas.microsoft.com/office/drawing/2016/5/12/chartex" xmlns:cx7="http://schemas.microsoft.com/office/drawing/2016/5/13/chartex" xmlns:cx8="http://schemas.microsoft.com/office/drawing/2016/5/14/chartex" xmlns:mc="http://schemas.openxmlformats.org/markup-compatibility/2006" xmlns:aink="http://schemas.microsoft.com/office/drawing/2016/ink" xmlns:am3d="http://schemas.microsoft.com/office/drawing/2017/model3d" xmlns:o="urn:schemas-microsoft-com:office:office" xmlns:r="http://schemas.openxmlformats.org/officeDocument/2006/relationships" xmlns:m="http://schemas.openxmlformats.org/officeDocument/2006/math" xmlns:v="urn:schemas-microsoft-com:vml" xmlns:wp14="http://schemas.microsoft.com/office/word/2010/wordprocessingDrawing" xmlns:wp="http://schemas.openxmlformats.org/drawingml/2006/wordprocessingDrawing" xmlns:w10="urn:schemas-microsoft-com:office:word" xmlns:w="http://schemas.openxmlformats.org/wordprocessingml/2006/main" xmlns:w14="http://schemas.microsoft.com/office/word/2010/wordml" xmlns:w15="http://schemas.microsoft.com/office/word/2012/wordml" xmlns:w16cid="http://schemas.microsoft.com/office/word/2016/wordml/cid" xmlns:w16se="http://schemas.microsoft.com/office/word/2015/wordml/symex" xmlns:wpg="http://schemas.microsoft.com/office/word/2010/wordprocessingGroup" xmlns:wpi="http://schemas.microsoft.com/office/word/2010/wordprocessingInk" xmlns:wne="http://schemas.microsoft.com/office/word/2006/wordml" xmlns:wps="http://schemas.microsoft.com/office/word/2010/wordprocessingShape" mc:Ignorable="w14 w15 w16se w16cid wp14">
+<w:footnotes xmlns:wpc="http://schemas.microsoft.com/office/word/2010/wordprocessingCanvas" xmlns:cx="http://schemas.microsoft.com/office/drawing/2014/chartex" xmlns:cx1="http://schemas.microsoft.com/office/drawing/2015/9/8/chartex" xmlns:cx2="http://schemas.microsoft.com/office/drawing/2015/10/21/chartex" xmlns:cx3="http://schemas.microsoft.com/office/drawing/2016/5/9/chartex" xmlns:cx4="http://schemas.microsoft.com/office/drawing/2016/5/10/chartex" xmlns:cx5="http://schemas.microsoft.com/office/drawing/2016/5/11/chartex" xmlns:cx6="http://schemas.microsoft.com/office/drawing/2016/5/12/chartex" xmlns:cx7="http://schemas.microsoft.com/office/drawing/2016/5/13/chartex" xmlns:cx8="http://schemas.microsoft.com/office/drawing/2016/5/14/chartex" xmlns:mc="http://schemas.openxmlformats.org/markup-compatibility/2006" xmlns:aink="http://schemas.microsoft.com/office/drawing/2016/ink" xmlns:am3d="http://schemas.microsoft.com/office/drawing/2017/model3d" xmlns:o="urn:schemas-microsoft-com:office:office" xmlns:oel="http://schemas.microsoft.com/office/2019/extlst" xmlns:r="http://schemas.openxmlformats.org/officeDocument/2006/relationships" xmlns:m="http://schemas.openxmlformats.org/officeDocument/2006/math" xmlns:v="urn:schemas-microsoft-com:vml" xmlns:wp14="http://schemas.microsoft.com/office/word/2010/wordprocessingDrawing" xmlns:wp="http://schemas.openxmlformats.org/drawingml/2006/wordprocessingDrawing" xmlns:w10="urn:schemas-microsoft-com:office:word" xmlns:w="http://schemas.openxmlformats.org/wordprocessingml/2006/main" xmlns:w14="http://schemas.microsoft.com/office/word/2010/wordml" xmlns:w15="http://schemas.microsoft.com/office/word/2012/wordml" xmlns:w16cex="http://schemas.microsoft.com/office/word/2018/wordml/cex" xmlns:w16cid="http://schemas.microsoft.com/office/word/2016/wordml/cid" xmlns:w16="http://schemas.microsoft.com/office/word/2018/wordml" xmlns:w16du="http://schemas.microsoft.com/office/word/2023/wordml/word16du" xmlns:w16sdtdh="http://schemas.microsoft.com/office/word/2020/wordml/sdtdatahash" xmlns:w16sdtfl="http://schemas.microsoft.com/office/word/2024/wordml/sdtformatlock" xmlns:w16se="http://schemas.microsoft.com/office/word/2015/wordml/symex" xmlns:wpg="http://schemas.microsoft.com/office/word/2010/wordprocessingGroup" xmlns:wpi="http://schemas.microsoft.com/office/word/2010/wordprocessingInk" xmlns:wne="http://schemas.microsoft.com/office/word/2006/wordml" xmlns:wps="http://schemas.microsoft.com/office/word/2010/wordprocessingShape" mc:Ignorable="w14 w15 w16se w16cid w16 w16cex w16sdtdh w16sdtfl w16du wp14">
   <w:footnote w:type="separator" w:id="-1">
     <w:p>
       <w:r>
@@ -366,7 +353,7 @@
 </file>
 
 <file path=word/header1.xml><?xml version="1.0" encoding="utf-8"?>
-<w:hdr xmlns:wpc="http://schemas.microsoft.com/office/word/2010/wordprocessingCanvas" xmlns:cx="http://schemas.microsoft.com/office/drawing/2014/chartex" xmlns:cx1="http://schemas.microsoft.com/office/drawing/2015/9/8/chartex" xmlns:cx2="http://schemas.microsoft.com/office/drawing/2015/10/21/chartex" xmlns:cx3="http://schemas.microsoft.com/office/drawing/2016/5/9/chartex" xmlns:cx4="http://schemas.microsoft.com/office/drawing/2016/5/10/chartex" xmlns:cx5="http://schemas.microsoft.com/office/drawing/2016/5/11/chartex" xmlns:cx6="http://schemas.microsoft.com/office/drawing/2016/5/12/chartex" xmlns:cx7="http://schemas.microsoft.com/office/drawing/2016/5/13/chartex" xmlns:cx8="http://schemas.microsoft.com/office/drawing/2016/5/14/chartex" xmlns:mc="http://schemas.openxmlformats.org/markup-compatibility/2006" xmlns:aink="http://schemas.microsoft.com/office/drawing/2016/ink" xmlns:am3d="http://schemas.microsoft.com/office/drawing/2017/model3d" xmlns:o="urn:schemas-microsoft-com:office:office" xmlns:r="http://schemas.openxmlformats.org/officeDocument/2006/relationships" xmlns:m="http://schemas.openxmlformats.org/officeDocument/2006/math" xmlns:v="urn:schemas-microsoft-com:vml" xmlns:wp14="http://schemas.microsoft.com/office/word/2010/wordprocessingDrawing" xmlns:wp="http://schemas.openxmlformats.org/drawingml/2006/wordprocessingDrawing" xmlns:w10="urn:schemas-microsoft-com:office:word" xmlns:w="http://schemas.openxmlformats.org/wordprocessingml/2006/main" xmlns:w14="http://schemas.microsoft.com/office/word/2010/wordml" xmlns:w15="http://schemas.microsoft.com/office/word/2012/wordml" xmlns:w16cid="http://schemas.microsoft.com/office/word/2016/wordml/cid" xmlns:w16se="http://schemas.microsoft.com/office/word/2015/wordml/symex" xmlns:wpg="http://schemas.microsoft.com/office/word/2010/wordprocessingGroup" xmlns:wpi="http://schemas.microsoft.com/office/word/2010/wordprocessingInk" xmlns:wne="http://schemas.microsoft.com/office/word/2006/wordml" xmlns:wps="http://schemas.microsoft.com/office/word/2010/wordprocessingShape" mc:Ignorable="w14 w15 w16se w16cid wp14">
+<w:hdr xmlns:wpc="http://schemas.microsoft.com/office/word/2010/wordprocessingCanvas" xmlns:cx="http://schemas.microsoft.com/office/drawing/2014/chartex" xmlns:cx1="http://schemas.microsoft.com/office/drawing/2015/9/8/chartex" xmlns:cx2="http://schemas.microsoft.com/office/drawing/2015/10/21/chartex" xmlns:cx3="http://schemas.microsoft.com/office/drawing/2016/5/9/chartex" xmlns:cx4="http://schemas.microsoft.com/office/drawing/2016/5/10/chartex" xmlns:cx5="http://schemas.microsoft.com/office/drawing/2016/5/11/chartex" xmlns:cx6="http://schemas.microsoft.com/office/drawing/2016/5/12/chartex" xmlns:cx7="http://schemas.microsoft.com/office/drawing/2016/5/13/chartex" xmlns:cx8="http://schemas.microsoft.com/office/drawing/2016/5/14/chartex" xmlns:mc="http://schemas.openxmlformats.org/markup-compatibility/2006" xmlns:aink="http://schemas.microsoft.com/office/drawing/2016/ink" xmlns:am3d="http://schemas.microsoft.com/office/drawing/2017/model3d" xmlns:o="urn:schemas-microsoft-com:office:office" xmlns:oel="http://schemas.microsoft.com/office/2019/extlst" xmlns:r="http://schemas.openxmlformats.org/officeDocument/2006/relationships" xmlns:m="http://schemas.openxmlformats.org/officeDocument/2006/math" xmlns:v="urn:schemas-microsoft-com:vml" xmlns:wp14="http://schemas.microsoft.com/office/word/2010/wordprocessingDrawing" xmlns:wp="http://schemas.openxmlformats.org/drawingml/2006/wordprocessingDrawing" xmlns:w10="urn:schemas-microsoft-com:office:word" xmlns:w="http://schemas.openxmlformats.org/wordprocessingml/2006/main" xmlns:w14="http://schemas.microsoft.com/office/word/2010/wordml" xmlns:w15="http://schemas.microsoft.com/office/word/2012/wordml" xmlns:w16cex="http://schemas.microsoft.com/office/word/2018/wordml/cex" xmlns:w16cid="http://schemas.microsoft.com/office/word/2016/wordml/cid" xmlns:w16="http://schemas.microsoft.com/office/word/2018/wordml" xmlns:w16du="http://schemas.microsoft.com/office/word/2023/wordml/word16du" xmlns:w16sdtdh="http://schemas.microsoft.com/office/word/2020/wordml/sdtdatahash" xmlns:w16sdtfl="http://schemas.microsoft.com/office/word/2024/wordml/sdtformatlock" xmlns:w16se="http://schemas.microsoft.com/office/word/2015/wordml/symex" xmlns:wpg="http://schemas.microsoft.com/office/word/2010/wordprocessingGroup" xmlns:wpi="http://schemas.microsoft.com/office/word/2010/wordprocessingInk" xmlns:wne="http://schemas.microsoft.com/office/word/2006/wordml" xmlns:wps="http://schemas.microsoft.com/office/word/2010/wordprocessingShape" mc:Ignorable="w14 w15 w16se w16cid w16 w16cex w16sdtdh w16sdtfl w16du wp14">
   <w:tbl>
     <w:tblPr>
       <w:tblW w:w="0" w:type="auto"/>
@@ -382,20 +369,24 @@
     </w:tblPr>
     <w:tblGrid>
       <w:gridCol w:w="913"/>
-      <w:gridCol w:w="770"/>
+      <w:gridCol w:w="120"/>
+      <w:gridCol w:w="650"/>
       <w:gridCol w:w="445"/>
       <w:gridCol w:w="900"/>
       <w:gridCol w:w="112"/>
       <w:gridCol w:w="816"/>
-      <w:gridCol w:w="1643"/>
+      <w:gridCol w:w="413"/>
+      <w:gridCol w:w="1230"/>
       <w:gridCol w:w="1014"/>
-      <w:gridCol w:w="672"/>
+      <w:gridCol w:w="641"/>
+      <w:gridCol w:w="31"/>
       <w:gridCol w:w="667"/>
       <w:gridCol w:w="61"/>
       <w:gridCol w:w="1343"/>
       <w:gridCol w:w="985"/>
       <w:gridCol w:w="127"/>
-      <w:gridCol w:w="730"/>
+      <w:gridCol w:w="558"/>
+      <w:gridCol w:w="172"/>
       <w:gridCol w:w="143"/>
       <w:gridCol w:w="457"/>
       <w:gridCol w:w="672"/>
@@ -418,7 +409,6 @@
             <w:left w:val="single" w:sz="1" w:space="0" w:color="000000"/>
             <w:bottom w:val="single" w:sz="1" w:space="0" w:color="000000"/>
           </w:tcBorders>
-          <w:shd w:val="clear" w:color="auto" w:fill="auto"/>
         </w:tcPr>
         <w:p>
           <w:pPr>
@@ -442,13 +432,12 @@
       <w:tc>
         <w:tcPr>
           <w:tcW w:w="1215" w:type="dxa"/>
-          <w:gridSpan w:val="2"/>
+          <w:gridSpan w:val="3"/>
           <w:tcBorders>
             <w:top w:val="single" w:sz="1" w:space="0" w:color="000000"/>
             <w:left w:val="single" w:sz="1" w:space="0" w:color="000000"/>
             <w:bottom w:val="single" w:sz="1" w:space="0" w:color="000000"/>
           </w:tcBorders>
-          <w:shd w:val="clear" w:color="auto" w:fill="auto"/>
         </w:tcPr>
         <w:p>
           <w:pPr>
@@ -469,7 +458,6 @@
             <w:left w:val="single" w:sz="1" w:space="0" w:color="000000"/>
             <w:bottom w:val="single" w:sz="1" w:space="0" w:color="000000"/>
           </w:tcBorders>
-          <w:shd w:val="clear" w:color="auto" w:fill="auto"/>
         </w:tcPr>
         <w:p>
           <w:pPr>
@@ -490,7 +478,6 @@
             <w:left w:val="single" w:sz="1" w:space="0" w:color="000000"/>
             <w:bottom w:val="single" w:sz="1" w:space="0" w:color="000000"/>
           </w:tcBorders>
-          <w:shd w:val="clear" w:color="auto" w:fill="auto"/>
         </w:tcPr>
         <w:p>
           <w:pPr>
@@ -505,12 +492,11 @@
       <w:tc>
         <w:tcPr>
           <w:tcW w:w="2657" w:type="dxa"/>
-          <w:gridSpan w:val="2"/>
+          <w:gridSpan w:val="3"/>
           <w:tcBorders>
             <w:left w:val="single" w:sz="1" w:space="0" w:color="000000"/>
             <w:bottom w:val="single" w:sz="1" w:space="0" w:color="000000"/>
           </w:tcBorders>
-          <w:shd w:val="clear" w:color="auto" w:fill="auto"/>
         </w:tcPr>
         <w:p>
           <w:pPr>
@@ -525,12 +511,12 @@
       <w:tc>
         <w:tcPr>
           <w:tcW w:w="672" w:type="dxa"/>
+          <w:gridSpan w:val="2"/>
           <w:tcBorders>
             <w:top w:val="single" w:sz="1" w:space="0" w:color="000000"/>
             <w:left w:val="single" w:sz="1" w:space="0" w:color="000000"/>
             <w:bottom w:val="single" w:sz="1" w:space="0" w:color="000000"/>
           </w:tcBorders>
-          <w:shd w:val="clear" w:color="auto" w:fill="auto"/>
         </w:tcPr>
         <w:p>
           <w:pPr>
@@ -551,7 +537,6 @@
             <w:left w:val="single" w:sz="1" w:space="0" w:color="000000"/>
             <w:bottom w:val="single" w:sz="1" w:space="0" w:color="000000"/>
           </w:tcBorders>
-          <w:shd w:val="clear" w:color="auto" w:fill="auto"/>
         </w:tcPr>
         <w:p>
           <w:pPr>
@@ -571,7 +556,6 @@
             <w:left w:val="single" w:sz="1" w:space="0" w:color="000000"/>
             <w:bottom w:val="single" w:sz="1" w:space="0" w:color="000000"/>
           </w:tcBorders>
-          <w:shd w:val="clear" w:color="auto" w:fill="auto"/>
         </w:tcPr>
         <w:p>
           <w:pPr>
@@ -591,7 +575,6 @@
             <w:left w:val="single" w:sz="1" w:space="0" w:color="000000"/>
             <w:bottom w:val="single" w:sz="1" w:space="0" w:color="000000"/>
           </w:tcBorders>
-          <w:shd w:val="clear" w:color="auto" w:fill="auto"/>
         </w:tcPr>
         <w:p>
           <w:pPr>
@@ -606,14 +589,13 @@
       <w:tc>
         <w:tcPr>
           <w:tcW w:w="857" w:type="dxa"/>
-          <w:gridSpan w:val="2"/>
+          <w:gridSpan w:val="3"/>
           <w:tcBorders>
             <w:top w:val="single" w:sz="1" w:space="0" w:color="000000"/>
             <w:left w:val="single" w:sz="1" w:space="0" w:color="000000"/>
             <w:bottom w:val="single" w:sz="1" w:space="0" w:color="000000"/>
             <w:right w:val="single" w:sz="8" w:space="0" w:color="000000"/>
           </w:tcBorders>
-          <w:shd w:val="clear" w:color="auto" w:fill="auto"/>
         </w:tcPr>
         <w:p>
           <w:pPr>
@@ -634,7 +616,6 @@
             <w:left w:val="single" w:sz="1" w:space="0" w:color="000000"/>
             <w:bottom w:val="single" w:sz="1" w:space="0" w:color="000000"/>
           </w:tcBorders>
-          <w:shd w:val="clear" w:color="auto" w:fill="auto"/>
         </w:tcPr>
         <w:p>
           <w:pPr>
@@ -654,7 +635,6 @@
             <w:left w:val="single" w:sz="1" w:space="0" w:color="000000"/>
             <w:bottom w:val="single" w:sz="1" w:space="0" w:color="000000"/>
           </w:tcBorders>
-          <w:shd w:val="clear" w:color="auto" w:fill="auto"/>
         </w:tcPr>
         <w:p>
           <w:pPr>
@@ -675,7 +655,6 @@
             <w:left w:val="single" w:sz="1" w:space="0" w:color="000000"/>
             <w:bottom w:val="single" w:sz="1" w:space="0" w:color="000000"/>
           </w:tcBorders>
-          <w:shd w:val="clear" w:color="auto" w:fill="auto"/>
         </w:tcPr>
         <w:p>
           <w:pPr>
@@ -696,7 +675,6 @@
             <w:left w:val="single" w:sz="1" w:space="0" w:color="000000"/>
             <w:bottom w:val="single" w:sz="1" w:space="0" w:color="000000"/>
           </w:tcBorders>
-          <w:shd w:val="clear" w:color="auto" w:fill="auto"/>
         </w:tcPr>
         <w:p>
           <w:pPr>
@@ -717,7 +695,6 @@
             <w:bottom w:val="single" w:sz="1" w:space="0" w:color="000000"/>
             <w:right w:val="single" w:sz="1" w:space="0" w:color="000000"/>
           </w:tcBorders>
-          <w:shd w:val="clear" w:color="auto" w:fill="auto"/>
         </w:tcPr>
         <w:p>
           <w:pPr>
@@ -734,14 +711,13 @@
       <w:tc>
         <w:tcPr>
           <w:tcW w:w="1683" w:type="dxa"/>
-          <w:gridSpan w:val="2"/>
+          <w:gridSpan w:val="3"/>
           <w:vMerge w:val="restart"/>
           <w:tcBorders>
             <w:top w:val="single" w:sz="4" w:space="0" w:color="000000"/>
             <w:left w:val="single" w:sz="4" w:space="0" w:color="000000"/>
             <w:bottom w:val="single" w:sz="4" w:space="0" w:color="000000"/>
           </w:tcBorders>
-          <w:shd w:val="clear" w:color="auto" w:fill="auto"/>
           <w:vAlign w:val="center"/>
         </w:tcPr>
         <w:p>
@@ -767,13 +743,12 @@
       <w:tc>
         <w:tcPr>
           <w:tcW w:w="3916" w:type="dxa"/>
-          <w:gridSpan w:val="5"/>
+          <w:gridSpan w:val="6"/>
           <w:tcBorders>
             <w:top w:val="single" w:sz="4" w:space="0" w:color="000000"/>
             <w:left w:val="single" w:sz="4" w:space="0" w:color="000000"/>
             <w:bottom w:val="single" w:sz="4" w:space="0" w:color="000000"/>
           </w:tcBorders>
-          <w:shd w:val="clear" w:color="auto" w:fill="auto"/>
         </w:tcPr>
         <w:p>
           <w:pPr>
@@ -795,13 +770,12 @@
       <w:tc>
         <w:tcPr>
           <w:tcW w:w="5742" w:type="dxa"/>
-          <w:gridSpan w:val="9"/>
+          <w:gridSpan w:val="11"/>
           <w:tcBorders>
             <w:top w:val="single" w:sz="4" w:space="0" w:color="000000"/>
             <w:left w:val="single" w:sz="4" w:space="0" w:color="000000"/>
             <w:bottom w:val="single" w:sz="4" w:space="0" w:color="000000"/>
           </w:tcBorders>
-          <w:shd w:val="clear" w:color="auto" w:fill="auto"/>
         </w:tcPr>
         <w:p>
           <w:pPr>
@@ -836,7 +810,6 @@
             <w:bottom w:val="single" w:sz="4" w:space="0" w:color="000000"/>
             <w:right w:val="single" w:sz="4" w:space="0" w:color="000000"/>
           </w:tcBorders>
-          <w:shd w:val="clear" w:color="auto" w:fill="auto"/>
         </w:tcPr>
         <w:p>
           <w:pPr>
@@ -855,14 +828,13 @@
       <w:tc>
         <w:tcPr>
           <w:tcW w:w="1683" w:type="dxa"/>
-          <w:gridSpan w:val="2"/>
+          <w:gridSpan w:val="3"/>
           <w:vMerge/>
           <w:tcBorders>
             <w:top w:val="single" w:sz="4" w:space="0" w:color="000000"/>
             <w:left w:val="single" w:sz="4" w:space="0" w:color="000000"/>
             <w:bottom w:val="single" w:sz="4" w:space="0" w:color="000000"/>
           </w:tcBorders>
-          <w:shd w:val="clear" w:color="auto" w:fill="auto"/>
           <w:vAlign w:val="center"/>
         </w:tcPr>
         <w:p/>
@@ -870,12 +842,11 @@
       <w:tc>
         <w:tcPr>
           <w:tcW w:w="9658" w:type="dxa"/>
-          <w:gridSpan w:val="14"/>
-          <w:tcBorders>
-            <w:left w:val="single" w:sz="4" w:space="0" w:color="000000"/>
-            <w:bottom w:val="single" w:sz="4" w:space="0" w:color="000000"/>
-          </w:tcBorders>
-          <w:shd w:val="clear" w:color="auto" w:fill="auto"/>
+          <w:gridSpan w:val="17"/>
+          <w:tcBorders>
+            <w:left w:val="single" w:sz="4" w:space="0" w:color="000000"/>
+            <w:bottom w:val="single" w:sz="4" w:space="0" w:color="000000"/>
+          </w:tcBorders>
         </w:tcPr>
         <w:p>
           <w:pPr>
@@ -912,7 +883,6 @@
             <w:bottom w:val="single" w:sz="4" w:space="0" w:color="000000"/>
             <w:right w:val="single" w:sz="4" w:space="0" w:color="000000"/>
           </w:tcBorders>
-          <w:shd w:val="clear" w:color="auto" w:fill="auto"/>
         </w:tcPr>
         <w:p>
           <w:pPr>
@@ -940,12 +910,11 @@
       <w:tc>
         <w:tcPr>
           <w:tcW w:w="1683" w:type="dxa"/>
-          <w:gridSpan w:val="2"/>
-          <w:tcBorders>
-            <w:left w:val="single" w:sz="4" w:space="0" w:color="000000"/>
-            <w:bottom w:val="single" w:sz="4" w:space="0" w:color="000000"/>
-          </w:tcBorders>
-          <w:shd w:val="clear" w:color="auto" w:fill="auto"/>
+          <w:gridSpan w:val="3"/>
+          <w:tcBorders>
+            <w:left w:val="single" w:sz="4" w:space="0" w:color="000000"/>
+            <w:bottom w:val="single" w:sz="4" w:space="0" w:color="000000"/>
+          </w:tcBorders>
         </w:tcPr>
         <w:p>
           <w:pPr>
@@ -970,7 +939,6 @@
             <w:left w:val="single" w:sz="4" w:space="0" w:color="000000"/>
             <w:bottom w:val="single" w:sz="4" w:space="0" w:color="000000"/>
           </w:tcBorders>
-          <w:shd w:val="clear" w:color="auto" w:fill="auto"/>
         </w:tcPr>
         <w:p>
           <w:pPr>
@@ -994,13 +962,12 @@
       <w:tc>
         <w:tcPr>
           <w:tcW w:w="2459" w:type="dxa"/>
-          <w:gridSpan w:val="2"/>
+          <w:gridSpan w:val="3"/>
           <w:vMerge w:val="restart"/>
           <w:tcBorders>
             <w:left w:val="single" w:sz="4" w:space="0" w:color="000000"/>
             <w:bottom w:val="single" w:sz="4" w:space="0" w:color="000000"/>
           </w:tcBorders>
-          <w:shd w:val="clear" w:color="auto" w:fill="auto"/>
         </w:tcPr>
         <w:p>
           <w:pPr>
@@ -1048,12 +1015,11 @@
       <w:tc>
         <w:tcPr>
           <w:tcW w:w="2353" w:type="dxa"/>
-          <w:gridSpan w:val="3"/>
-          <w:tcBorders>
-            <w:left w:val="single" w:sz="4" w:space="0" w:color="000000"/>
-            <w:bottom w:val="single" w:sz="4" w:space="0" w:color="000000"/>
-          </w:tcBorders>
-          <w:shd w:val="clear" w:color="auto" w:fill="auto"/>
+          <w:gridSpan w:val="4"/>
+          <w:tcBorders>
+            <w:left w:val="single" w:sz="4" w:space="0" w:color="000000"/>
+            <w:bottom w:val="single" w:sz="4" w:space="0" w:color="000000"/>
+          </w:tcBorders>
         </w:tcPr>
         <w:p>
           <w:pPr>
@@ -1092,7 +1058,6 @@
             <w:left w:val="single" w:sz="4" w:space="0" w:color="000000"/>
             <w:bottom w:val="single" w:sz="4" w:space="0" w:color="000000"/>
           </w:tcBorders>
-          <w:shd w:val="clear" w:color="auto" w:fill="auto"/>
         </w:tcPr>
         <w:p>
           <w:pPr>
@@ -1116,12 +1081,11 @@
       <w:tc>
         <w:tcPr>
           <w:tcW w:w="2109" w:type="dxa"/>
-          <w:gridSpan w:val="5"/>
-          <w:tcBorders>
-            <w:left w:val="single" w:sz="4" w:space="0" w:color="000000"/>
-            <w:bottom w:val="single" w:sz="4" w:space="0" w:color="000000"/>
-          </w:tcBorders>
-          <w:shd w:val="clear" w:color="auto" w:fill="auto"/>
+          <w:gridSpan w:val="6"/>
+          <w:tcBorders>
+            <w:left w:val="single" w:sz="4" w:space="0" w:color="000000"/>
+            <w:bottom w:val="single" w:sz="4" w:space="0" w:color="000000"/>
+          </w:tcBorders>
         </w:tcPr>
         <w:p>
           <w:pPr>
@@ -1159,7 +1123,6 @@
             <w:left w:val="single" w:sz="4" w:space="0" w:color="000000"/>
             <w:bottom w:val="single" w:sz="4" w:space="0" w:color="000000"/>
           </w:tcBorders>
-          <w:shd w:val="clear" w:color="auto" w:fill="auto"/>
         </w:tcPr>
         <w:p>
           <w:pPr>
@@ -1180,7 +1143,6 @@
             <w:left w:val="single" w:sz="4" w:space="0" w:color="000000"/>
             <w:bottom w:val="single" w:sz="4" w:space="0" w:color="000000"/>
           </w:tcBorders>
-          <w:shd w:val="clear" w:color="auto" w:fill="auto"/>
         </w:tcPr>
         <w:p>
           <w:pPr>
@@ -1210,7 +1172,6 @@
             <w:bottom w:val="single" w:sz="4" w:space="0" w:color="000000"/>
             <w:right w:val="single" w:sz="4" w:space="0" w:color="000000"/>
           </w:tcBorders>
-          <w:shd w:val="clear" w:color="auto" w:fill="auto"/>
         </w:tcPr>
         <w:p>
           <w:pPr>
@@ -1264,12 +1225,11 @@
       <w:tc>
         <w:tcPr>
           <w:tcW w:w="1683" w:type="dxa"/>
-          <w:gridSpan w:val="2"/>
-          <w:tcBorders>
-            <w:left w:val="single" w:sz="4" w:space="0" w:color="000000"/>
-            <w:bottom w:val="single" w:sz="4" w:space="0" w:color="000000"/>
-          </w:tcBorders>
-          <w:shd w:val="clear" w:color="auto" w:fill="auto"/>
+          <w:gridSpan w:val="3"/>
+          <w:tcBorders>
+            <w:left w:val="single" w:sz="4" w:space="0" w:color="000000"/>
+            <w:bottom w:val="single" w:sz="4" w:space="0" w:color="000000"/>
+          </w:tcBorders>
         </w:tcPr>
         <w:p/>
       </w:tc>
@@ -1281,32 +1241,29 @@
             <w:left w:val="single" w:sz="4" w:space="0" w:color="000000"/>
             <w:bottom w:val="single" w:sz="4" w:space="0" w:color="000000"/>
           </w:tcBorders>
-          <w:shd w:val="clear" w:color="auto" w:fill="auto"/>
         </w:tcPr>
         <w:p/>
       </w:tc>
       <w:tc>
         <w:tcPr>
           <w:tcW w:w="2459" w:type="dxa"/>
-          <w:gridSpan w:val="2"/>
+          <w:gridSpan w:val="3"/>
           <w:vMerge/>
           <w:tcBorders>
             <w:left w:val="single" w:sz="4" w:space="0" w:color="000000"/>
             <w:bottom w:val="single" w:sz="4" w:space="0" w:color="000000"/>
           </w:tcBorders>
-          <w:shd w:val="clear" w:color="auto" w:fill="auto"/>
         </w:tcPr>
         <w:p/>
       </w:tc>
       <w:tc>
         <w:tcPr>
           <w:tcW w:w="2353" w:type="dxa"/>
-          <w:gridSpan w:val="3"/>
-          <w:tcBorders>
-            <w:left w:val="single" w:sz="4" w:space="0" w:color="000000"/>
-            <w:bottom w:val="single" w:sz="4" w:space="0" w:color="000000"/>
-          </w:tcBorders>
-          <w:shd w:val="clear" w:color="auto" w:fill="auto"/>
+          <w:gridSpan w:val="4"/>
+          <w:tcBorders>
+            <w:left w:val="single" w:sz="4" w:space="0" w:color="000000"/>
+            <w:bottom w:val="single" w:sz="4" w:space="0" w:color="000000"/>
+          </w:tcBorders>
         </w:tcPr>
         <w:p>
           <w:pPr>
@@ -1327,7 +1284,6 @@
             <w:left w:val="single" w:sz="4" w:space="0" w:color="000000"/>
             <w:bottom w:val="single" w:sz="4" w:space="0" w:color="000000"/>
           </w:tcBorders>
-          <w:shd w:val="clear" w:color="auto" w:fill="auto"/>
         </w:tcPr>
         <w:p>
           <w:pPr>
@@ -1343,12 +1299,11 @@
       <w:tc>
         <w:tcPr>
           <w:tcW w:w="2109" w:type="dxa"/>
-          <w:gridSpan w:val="5"/>
-          <w:tcBorders>
-            <w:left w:val="single" w:sz="4" w:space="0" w:color="000000"/>
-            <w:bottom w:val="single" w:sz="4" w:space="0" w:color="000000"/>
-          </w:tcBorders>
-          <w:shd w:val="clear" w:color="auto" w:fill="auto"/>
+          <w:gridSpan w:val="6"/>
+          <w:tcBorders>
+            <w:left w:val="single" w:sz="4" w:space="0" w:color="000000"/>
+            <w:bottom w:val="single" w:sz="4" w:space="0" w:color="000000"/>
+          </w:tcBorders>
         </w:tcPr>
         <w:p>
           <w:pPr>
@@ -1368,7 +1323,6 @@
             <w:left w:val="single" w:sz="4" w:space="0" w:color="000000"/>
             <w:bottom w:val="single" w:sz="4" w:space="0" w:color="000000"/>
           </w:tcBorders>
-          <w:shd w:val="clear" w:color="auto" w:fill="auto"/>
         </w:tcPr>
         <w:p/>
       </w:tc>
@@ -1380,7 +1334,6 @@
             <w:left w:val="single" w:sz="4" w:space="0" w:color="000000"/>
             <w:bottom w:val="single" w:sz="4" w:space="0" w:color="000000"/>
           </w:tcBorders>
-          <w:shd w:val="clear" w:color="auto" w:fill="auto"/>
         </w:tcPr>
         <w:p>
           <w:pPr>
@@ -1397,9 +1350,149 @@
             <w:bottom w:val="single" w:sz="4" w:space="0" w:color="000000"/>
             <w:right w:val="single" w:sz="4" w:space="0" w:color="000000"/>
           </w:tcBorders>
-          <w:shd w:val="clear" w:color="auto" w:fill="auto"/>
         </w:tcPr>
         <w:p/>
+      </w:tc>
+    </w:tr>
+    <w:tr>
+      <w:tc>
+        <w:tcPr>
+          <w:tcW w:w="1033" w:type="dxa"/>
+          <w:gridSpan w:val="2"/>
+          <w:tcBorders>
+            <w:top w:val="single" w:sz="4" w:space="0" w:color="auto"/>
+            <w:left w:val="single" w:sz="4" w:space="0" w:color="auto"/>
+            <w:bottom w:val="single" w:sz="4" w:space="0" w:color="auto"/>
+            <w:right w:val="single" w:sz="4" w:space="0" w:color="auto"/>
+          </w:tcBorders>
+        </w:tcPr>
+        <w:p>
+          <w:pPr>
+            <w:pStyle w:val="a8"/>
+            <w:jc w:val="center"/>
+            <w:rPr>
+              <w:rFonts w:ascii="Arial" w:hAnsi="Arial"/>
+            </w:rPr>
+          </w:pPr>
+          <w:r>
+            <w:rPr>
+              <w:rFonts w:ascii="Arial" w:hAnsi="Arial"/>
+            </w:rPr>
+            <w:t>1</w:t>
+          </w:r>
+        </w:p>
+      </w:tc>
+      <w:tc>
+        <w:tcPr>
+          <w:tcW w:w="3336" w:type="dxa"/>
+          <w:gridSpan w:val="6"/>
+          <w:tcBorders>
+            <w:top w:val="single" w:sz="4" w:space="0" w:color="auto"/>
+            <w:left w:val="single" w:sz="4" w:space="0" w:color="auto"/>
+            <w:bottom w:val="single" w:sz="4" w:space="0" w:color="auto"/>
+            <w:right w:val="single" w:sz="4" w:space="0" w:color="auto"/>
+          </w:tcBorders>
+        </w:tcPr>
+        <w:p>
+          <w:pPr>
+            <w:pStyle w:val="a8"/>
+            <w:jc w:val="center"/>
+            <w:rPr>
+              <w:rFonts w:ascii="Arial" w:hAnsi="Arial"/>
+            </w:rPr>
+          </w:pPr>
+          <w:r>
+            <w:rPr>
+              <w:rFonts w:ascii="Arial" w:hAnsi="Arial"/>
+            </w:rPr>
+            <w:t>2</w:t>
+          </w:r>
+        </w:p>
+      </w:tc>
+      <w:tc>
+        <w:tcPr>
+          <w:tcW w:w="2885" w:type="dxa"/>
+          <w:gridSpan w:val="3"/>
+          <w:tcBorders>
+            <w:top w:val="single" w:sz="4" w:space="0" w:color="auto"/>
+            <w:left w:val="single" w:sz="4" w:space="0" w:color="auto"/>
+            <w:bottom w:val="single" w:sz="4" w:space="0" w:color="auto"/>
+            <w:right w:val="single" w:sz="4" w:space="0" w:color="auto"/>
+          </w:tcBorders>
+        </w:tcPr>
+        <w:p>
+          <w:pPr>
+            <w:pStyle w:val="a8"/>
+            <w:jc w:val="center"/>
+            <w:rPr>
+              <w:rFonts w:ascii="Arial" w:hAnsi="Arial"/>
+            </w:rPr>
+          </w:pPr>
+          <w:r>
+            <w:rPr>
+              <w:rFonts w:ascii="Arial" w:hAnsi="Arial"/>
+            </w:rPr>
+            <w:t>3</w:t>
+          </w:r>
+        </w:p>
+      </w:tc>
+      <w:tc>
+        <w:tcPr>
+          <w:tcW w:w="3772" w:type="dxa"/>
+          <w:gridSpan w:val="7"/>
+          <w:tcBorders>
+            <w:top w:val="single" w:sz="4" w:space="0" w:color="auto"/>
+            <w:left w:val="single" w:sz="4" w:space="0" w:color="auto"/>
+            <w:bottom w:val="single" w:sz="4" w:space="0" w:color="auto"/>
+            <w:right w:val="single" w:sz="4" w:space="0" w:color="auto"/>
+          </w:tcBorders>
+        </w:tcPr>
+        <w:p>
+          <w:pPr>
+            <w:pStyle w:val="a8"/>
+            <w:jc w:val="center"/>
+            <w:rPr>
+              <w:rFonts w:ascii="Arial" w:hAnsi="Arial"/>
+              <w:lang w:val="en-US"/>
+            </w:rPr>
+          </w:pPr>
+          <w:r>
+            <w:rPr>
+              <w:rFonts w:ascii="Arial" w:hAnsi="Arial"/>
+              <w:lang w:val="en-US"/>
+            </w:rPr>
+            <w:t>4</w:t>
+          </w:r>
+        </w:p>
+      </w:tc>
+      <w:tc>
+        <w:tcPr>
+          <w:tcW w:w="4564" w:type="dxa"/>
+          <w:gridSpan w:val="10"/>
+          <w:tcBorders>
+            <w:top w:val="single" w:sz="4" w:space="0" w:color="auto"/>
+            <w:left w:val="single" w:sz="4" w:space="0" w:color="auto"/>
+            <w:bottom w:val="single" w:sz="4" w:space="0" w:color="auto"/>
+            <w:right w:val="single" w:sz="4" w:space="0" w:color="auto"/>
+          </w:tcBorders>
+        </w:tcPr>
+        <w:p>
+          <w:pPr>
+            <w:pStyle w:val="a8"/>
+            <w:jc w:val="center"/>
+            <w:rPr>
+              <w:rFonts w:ascii="Arial" w:hAnsi="Arial"/>
+              <w:lang w:val="en-US"/>
+            </w:rPr>
+          </w:pPr>
+          <w:r>
+            <w:rPr>
+              <w:rFonts w:ascii="Arial" w:hAnsi="Arial"/>
+              <w:lang w:val="en-US"/>
+            </w:rPr>
+            <w:t>5</w:t>
+          </w:r>
+        </w:p>
       </w:tc>
     </w:tr>
   </w:tbl>
@@ -1412,7 +1505,7 @@
 </file>
 
 <file path=word/styles.xml><?xml version="1.0" encoding="utf-8"?>
-<w:styles xmlns:mc="http://schemas.openxmlformats.org/markup-compatibility/2006" xmlns:r="http://schemas.openxmlformats.org/officeDocument/2006/relationships" xmlns:w="http://schemas.openxmlformats.org/wordprocessingml/2006/main" xmlns:w14="http://schemas.microsoft.com/office/word/2010/wordml" xmlns:w15="http://schemas.microsoft.com/office/word/2012/wordml" xmlns:w16cid="http://schemas.microsoft.com/office/word/2016/wordml/cid" xmlns:w16se="http://schemas.microsoft.com/office/word/2015/wordml/symex" mc:Ignorable="w14 w15 w16se w16cid">
+<w:styles xmlns:mc="http://schemas.openxmlformats.org/markup-compatibility/2006" xmlns:r="http://schemas.openxmlformats.org/officeDocument/2006/relationships" xmlns:w="http://schemas.openxmlformats.org/wordprocessingml/2006/main" xmlns:w14="http://schemas.microsoft.com/office/word/2010/wordml" xmlns:w15="http://schemas.microsoft.com/office/word/2012/wordml" xmlns:w16cex="http://schemas.microsoft.com/office/word/2018/wordml/cex" xmlns:w16cid="http://schemas.microsoft.com/office/word/2016/wordml/cid" xmlns:w16="http://schemas.microsoft.com/office/word/2018/wordml" xmlns:w16du="http://schemas.microsoft.com/office/word/2023/wordml/word16du" xmlns:w16sdtdh="http://schemas.microsoft.com/office/word/2020/wordml/sdtdatahash" xmlns:w16sdtfl="http://schemas.microsoft.com/office/word/2024/wordml/sdtformatlock" xmlns:w16se="http://schemas.microsoft.com/office/word/2015/wordml/symex" mc:Ignorable="w14 w15 w16se w16cid w16 w16cex w16sdtdh w16sdtfl w16du">
   <w:docDefaults>
     <w:rPrDefault>
       <w:rPr>
@@ -1422,7 +1515,7 @@
     </w:rPrDefault>
     <w:pPrDefault/>
   </w:docDefaults>
-  <w:latentStyles w:defLockedState="0" w:defUIPriority="99" w:defSemiHidden="0" w:defUnhideWhenUsed="0" w:defQFormat="0" w:count="375">
+  <w:latentStyles w:defLockedState="0" w:defUIPriority="99" w:defSemiHidden="0" w:defUnhideWhenUsed="0" w:defQFormat="0" w:count="376">
     <w:lsdException w:name="Normal" w:uiPriority="0" w:qFormat="1"/>
     <w:lsdException w:name="heading 1" w:uiPriority="9" w:qFormat="1"/>
     <w:lsdException w:name="heading 2" w:semiHidden="1" w:uiPriority="9" w:unhideWhenUsed="1" w:qFormat="1"/>
@@ -1798,6 +1891,7 @@
     <w:lsdException w:name="Smart Hyperlink" w:semiHidden="1" w:unhideWhenUsed="1"/>
     <w:lsdException w:name="Hashtag" w:semiHidden="1" w:unhideWhenUsed="1"/>
     <w:lsdException w:name="Unresolved Mention" w:semiHidden="1" w:unhideWhenUsed="1"/>
+    <w:lsdException w:name="Smart Link" w:semiHidden="1" w:unhideWhenUsed="1"/>
   </w:latentStyles>
   <w:style w:type="paragraph" w:default="1" w:styleId="a">
     <w:name w:val="Normal"/>

</xml_diff>